<commit_message>
Entry #050: ADR-047 step 7 (ADR-021/033/043/046 marked; ADR-046 §15 closes F3/F9/F10, scopes F2); F9 residue; post-reboot checks, F17; generator v9.6-v9.9 (USDA/IRS scope filters, clickable links, --test-email, IT Governance section, every-section layout, Appendices A-C); ADR-048 with verified source register (TSSR 12.1, ARC-AMPE 1.0.4), Part A built; DECISIONS.md amended; F16 recurred; sub-regulatory guidance gap queued (ADR-049); fourth §2 breach disclosed
Co-Authored-By: Claude Opus 5.5 <noreply@anthropic.com>
</commit_message>
<xml_diff>
--- a/ADR_021.docx
+++ b/ADR_021.docx
@@ -191,6 +191,9 @@
             <w:r>
               <w:t xml:space="preserve">STUB — fragments only, original not recovered</w:t>
             </w:r>
+            <w:r>
+              <w:t xml:space="preserve"> — AMENDED September 29, 2026 by ADR-047 §7–§8 (marked in place September 30, 2026): tier labels redefined — Tier 1 Local, reserved and unassigned; Tier 2 Local, the deployed model; Tier 3 Claude API standard, disabled until built; Tier 4 Claude API top, operator-gated, disabled until built. The 0.85 / 0.90 confidence-escalation thresholds are retired. Escalation to the API is explicit, never automatic. A rebuilt cloud path targets the Anthropic API directly, not OpenRouter.</w:t>
+            </w:r>
           </w:p>
         </w:tc>
       </w:tr>
@@ -355,6 +358,19 @@
     <w:p>
       <w:pPr>
         <w:pStyle w:val="ListParagraph"/>
+        <w:spacing w:after="80"/>
+      </w:pPr>
+      <w:r>
+        <w:rPr>
+          <w:i/>
+          <w:iCs/>
+        </w:rPr>
+        <w:t xml:space="preserve">ADR-047 amendment (September 29, 2026; marked in place September 30, 2026): labels replaced per ADR-047 §8 (tier integers unchanged). Tier 3 is no longer OpenRouter; Tiers 3 and 4 are disabled until built, and call_openrouter() returns an explicit "cloud path disabled (ADR-047)" error.</w:t>
+      </w:r>
+    </w:p>
+    <w:p>
+      <w:pPr>
+        <w:pStyle w:val="ListParagraph"/>
         <w:numPr>
           <w:ilvl w:val="0"/>
           <w:numId w:val="1"/>
@@ -381,6 +397,19 @@
     <w:p>
       <w:pPr>
         <w:pStyle w:val="ListParagraph"/>
+        <w:spacing w:after="80"/>
+      </w:pPr>
+      <w:r>
+        <w:rPr>
+          <w:i/>
+          <w:iCs/>
+        </w:rPr>
+        <w:t xml:space="preserve">ADR-047 amendment (September 29, 2026; marked in place September 30, 2026): RETIRED (ADR-047 §7). The thresholds are unverified stub content, were never implemented, and local models do not produce calibrated confidence to compare against. Escalation triggers are only a task exceeding the local context ceiling or an operator request.</w:t>
+      </w:r>
+    </w:p>
+    <w:p>
+      <w:pPr>
+        <w:pStyle w:val="ListParagraph"/>
         <w:numPr>
           <w:ilvl w:val="0"/>
           <w:numId w:val="1"/>
@@ -389,6 +418,19 @@
       </w:pPr>
       <w:r>
         <w:t xml:space="preserve">ADR-036 §12 cross-reference: “ADR-021 | LayerModel Authority. GPU allocation directly enables Tier 2 model loads (32B) without CPU fallback. This ADR is a prerequisite for reliable Tier 2 inference.”</w:t>
+      </w:r>
+    </w:p>
+    <w:p>
+      <w:pPr>
+        <w:pStyle w:val="ListParagraph"/>
+        <w:spacing w:after="80"/>
+      </w:pPr>
+      <w:r>
+        <w:rPr>
+          <w:i/>
+          <w:iCs/>
+        </w:rPr>
+        <w:t xml:space="preserve">Note (September 30, 2026): ADR-036 is SUPERSEDED by ADR-044. No 32B model is deployed; Tier 2 is gemma4:e4b (ADR-047 §14).</w:t>
       </w:r>
     </w:p>
     <w:p>

</xml_diff>